<commit_message>
ui design mostly completed
</commit_message>
<xml_diff>
--- a/stationary_prd.docx
+++ b/stationary_prd.docx
@@ -4546,27 +4546,21 @@
           <w:sz w:val="24"/>
           <w:sz-cs w:val="24"/>
         </w:rPr>
-        <w:t xml:space="preserve"/>
-        <w:tab/>
-        <w:t xml:space="preserve">•</w:t>
-        <w:tab/>
-        <w:t xml:space="preserve"/>
-      </w:r>
-      <w:r>
-        <w:rPr>
-          <w:rFonts w:ascii="Songti SC" w:hAnsi="Songti SC" w:cs="Songti SC"/>
-          <w:sz w:val="24"/>
-          <w:sz-cs w:val="24"/>
-        </w:rPr>
-        <w:t xml:space="preserve">用户上传图片或附件；</w:t>
-      </w:r>
-      <w:r>
-        <w:rPr>
-          <w:rFonts w:ascii="Times" w:hAnsi="Times" w:cs="Times"/>
-          <w:sz w:val="24"/>
-          <w:sz-cs w:val="24"/>
-        </w:rPr>
-        <w:t xml:space="preserve"/>
+        <w:t>•信件正文内的图片 / 附件上传（头像上传除外）；</w:t>
+      </w:r>
+      <w:r>
+        <w:rPr>
+          <w:rFonts w:ascii="Songti SC" w:hAnsi="Songti SC" w:cs="Songti SC"/>
+          <w:sz w:val="24"/>
+          <w:sz-cs w:val="24"/>
+        </w:rPr>
+      </w:r>
+      <w:r>
+        <w:rPr>
+          <w:rFonts w:ascii="Times" w:hAnsi="Times" w:cs="Times"/>
+          <w:sz w:val="24"/>
+          <w:sz-cs w:val="24"/>
+        </w:rPr>
       </w:r>
     </w:p>
     <w:p>
@@ -8117,27 +8111,21 @@
           <w:sz w:val="24"/>
           <w:sz-cs w:val="24"/>
         </w:rPr>
-        <w:t xml:space="preserve"/>
-        <w:tab/>
-        <w:t xml:space="preserve">•</w:t>
-        <w:tab/>
-        <w:t xml:space="preserve"/>
-      </w:r>
-      <w:r>
-        <w:rPr>
-          <w:rFonts w:ascii="Songti SC" w:hAnsi="Songti SC" w:cs="Songti SC"/>
-          <w:sz w:val="24"/>
-          <w:sz-cs w:val="24"/>
-        </w:rPr>
-        <w:t xml:space="preserve">用户没有像素角色和头像编辑器；</w:t>
-      </w:r>
-      <w:r>
-        <w:rPr>
-          <w:rFonts w:ascii="Times" w:hAnsi="Times" w:cs="Times"/>
-          <w:sz w:val="24"/>
-          <w:sz-cs w:val="24"/>
-        </w:rPr>
-        <w:t xml:space="preserve"/>
+        <w:t>•用户没有像素角色；可上传自定义头像（存 Supabase Storage 的 avatars bucket，profiles.avatar_path 存对象路径），并可修改用户名与密码；</w:t>
+      </w:r>
+      <w:r>
+        <w:rPr>
+          <w:rFonts w:ascii="Songti SC" w:hAnsi="Songti SC" w:cs="Songti SC"/>
+          <w:sz w:val="24"/>
+          <w:sz-cs w:val="24"/>
+        </w:rPr>
+      </w:r>
+      <w:r>
+        <w:rPr>
+          <w:rFonts w:ascii="Times" w:hAnsi="Times" w:cs="Times"/>
+          <w:sz w:val="24"/>
+          <w:sz-cs w:val="24"/>
+        </w:rPr>
       </w:r>
     </w:p>
     <w:p>
@@ -20600,11 +20588,12 @@
           <w:sz w:val="24"/>
           <w:sz-cs w:val="24"/>
         </w:rPr>
-        <w:t xml:space="preserve">create extension if not exists pgcrypto;</w:t>
-        <w:br/>
-        <w:t xml:space="preserve"/>
-        <w:br/>
-        <w:t xml:space="preserve">create type public.account_status as enum (</w:t>
+        <w:t>create extension if not exists pgcrypto;</w:t>
+        <w:br/>
+        <w:t>create extension if not exists citext;</w:t>
+        <w:br/>
+        <w:br/>
+        <w:t>create type public.account_status as enum (</w:t>
         <w:br/>
         <w:t xml:space="preserve">  'active',</w:t>
         <w:br/>
@@ -20612,11 +20601,10 @@
         <w:br/>
         <w:t xml:space="preserve">  'deleted'</w:t>
         <w:br/>
-        <w:t xml:space="preserve">);</w:t>
-        <w:br/>
-        <w:t xml:space="preserve"/>
-        <w:br/>
-        <w:t xml:space="preserve">create type public.letter_status as enum (</w:t>
+        <w:t>);</w:t>
+        <w:br/>
+        <w:br/>
+        <w:t>create type public.letter_status as enum (</w:t>
         <w:br/>
         <w:t xml:space="preserve">  'draft',</w:t>
         <w:br/>
@@ -20628,21 +20616,19 @@
         <w:br/>
         <w:t xml:space="preserve">  'removed'</w:t>
         <w:br/>
-        <w:t xml:space="preserve">);</w:t>
-        <w:br/>
-        <w:t xml:space="preserve"/>
-        <w:br/>
-        <w:t xml:space="preserve">create type public.delivery_batch_reason as enum (</w:t>
+        <w:t>);</w:t>
+        <w:br/>
+        <w:br/>
+        <w:t>create type public.delivery_batch_reason as enum (</w:t>
         <w:br/>
         <w:t xml:space="preserve">  'bookstore_visit',</w:t>
         <w:br/>
         <w:t xml:space="preserve">  'manual_refresh'</w:t>
         <w:br/>
-        <w:t xml:space="preserve">);</w:t>
-        <w:br/>
-        <w:t xml:space="preserve"/>
-        <w:br/>
-        <w:t xml:space="preserve">create type public.delivery_batch_status as enum (</w:t>
+        <w:t>);</w:t>
+        <w:br/>
+        <w:br/>
+        <w:t>create type public.delivery_batch_status as enum (</w:t>
         <w:br/>
         <w:t xml:space="preserve">  'active',</w:t>
         <w:br/>
@@ -20650,21 +20636,19 @@
         <w:br/>
         <w:t xml:space="preserve">  'expired'</w:t>
         <w:br/>
-        <w:t xml:space="preserve">);</w:t>
-        <w:br/>
-        <w:t xml:space="preserve"/>
-        <w:br/>
-        <w:t xml:space="preserve">create type public.conversation_responder_type as enum (</w:t>
+        <w:t>);</w:t>
+        <w:br/>
+        <w:br/>
+        <w:t>create type public.conversation_responder_type as enum (</w:t>
         <w:br/>
         <w:t xml:space="preserve">  'human',</w:t>
         <w:br/>
         <w:t xml:space="preserve">  'ai_character'</w:t>
         <w:br/>
-        <w:t xml:space="preserve">);</w:t>
-        <w:br/>
-        <w:t xml:space="preserve"/>
-        <w:br/>
-        <w:t xml:space="preserve">create type public.conversation_status as enum (</w:t>
+        <w:t>);</w:t>
+        <w:br/>
+        <w:br/>
+        <w:t>create type public.conversation_status as enum (</w:t>
         <w:br/>
         <w:t xml:space="preserve">  'active',</w:t>
         <w:br/>
@@ -20674,11 +20658,10 @@
         <w:br/>
         <w:t xml:space="preserve">  'removed'</w:t>
         <w:br/>
-        <w:t xml:space="preserve">);</w:t>
-        <w:br/>
-        <w:t xml:space="preserve"/>
-        <w:br/>
-        <w:t xml:space="preserve">create type public.message_sender_type as enum (</w:t>
+        <w:t>);</w:t>
+        <w:br/>
+        <w:br/>
+        <w:t>create type public.message_sender_type as enum (</w:t>
         <w:br/>
         <w:t xml:space="preserve">  'user',</w:t>
         <w:br/>
@@ -20686,11 +20669,10 @@
         <w:br/>
         <w:t xml:space="preserve">  'system'</w:t>
         <w:br/>
-        <w:t xml:space="preserve">);</w:t>
-        <w:br/>
-        <w:t xml:space="preserve"/>
-        <w:br/>
-        <w:t xml:space="preserve">create type public.message_delivery_status as enum (</w:t>
+        <w:t>);</w:t>
+        <w:br/>
+        <w:br/>
+        <w:t>create type public.message_delivery_status as enum (</w:t>
         <w:br/>
         <w:t xml:space="preserve">  'scheduled',</w:t>
         <w:br/>
@@ -20700,11 +20682,10 @@
         <w:br/>
         <w:t xml:space="preserve">  'removed'</w:t>
         <w:br/>
-        <w:t xml:space="preserve">);</w:t>
-        <w:br/>
-        <w:t xml:space="preserve"/>
-        <w:br/>
-        <w:t xml:space="preserve">create type public.ai_prompt_status as enum (</w:t>
+        <w:t>);</w:t>
+        <w:br/>
+        <w:br/>
+        <w:t>create type public.ai_prompt_status as enum (</w:t>
         <w:br/>
         <w:t xml:space="preserve">  'draft',</w:t>
         <w:br/>
@@ -20712,11 +20693,10 @@
         <w:br/>
         <w:t xml:space="preserve">  'retired'</w:t>
         <w:br/>
-        <w:t xml:space="preserve">);</w:t>
-        <w:br/>
-        <w:t xml:space="preserve"/>
-        <w:br/>
-        <w:t xml:space="preserve">create type public.ai_job_trigger_reason as enum (</w:t>
+        <w:t>);</w:t>
+        <w:br/>
+        <w:br/>
+        <w:t>create type public.ai_job_trigger_reason as enum (</w:t>
         <w:br/>
         <w:t xml:space="preserve">  'unanswered_public_letter',</w:t>
         <w:br/>
@@ -20724,11 +20704,10 @@
         <w:br/>
         <w:t xml:space="preserve">  'manual_test'</w:t>
         <w:br/>
-        <w:t xml:space="preserve">);</w:t>
-        <w:br/>
-        <w:t xml:space="preserve"/>
-        <w:br/>
-        <w:t xml:space="preserve">create type public.ai_job_status as enum (</w:t>
+        <w:t>);</w:t>
+        <w:br/>
+        <w:br/>
+        <w:t>create type public.ai_job_status as enum (</w:t>
         <w:br/>
         <w:t xml:space="preserve">  'scheduled',</w:t>
         <w:br/>
@@ -20742,11 +20721,10 @@
         <w:br/>
         <w:t xml:space="preserve">  'blocked_by_safety'</w:t>
         <w:br/>
-        <w:t xml:space="preserve">);</w:t>
-        <w:br/>
-        <w:t xml:space="preserve"/>
-        <w:br/>
-        <w:t xml:space="preserve">create type public.report_target_type as enum (</w:t>
+        <w:t>);</w:t>
+        <w:br/>
+        <w:br/>
+        <w:t>create type public.report_target_type as enum (</w:t>
         <w:br/>
         <w:t xml:space="preserve">  'public_letter',</w:t>
         <w:br/>
@@ -20754,11 +20732,10 @@
         <w:br/>
         <w:t xml:space="preserve">  'user'</w:t>
         <w:br/>
-        <w:t xml:space="preserve">);</w:t>
-        <w:br/>
-        <w:t xml:space="preserve"/>
-        <w:br/>
-        <w:t xml:space="preserve">create type public.report_reason as enum (</w:t>
+        <w:t>);</w:t>
+        <w:br/>
+        <w:br/>
+        <w:t>create type public.report_reason as enum (</w:t>
         <w:br/>
         <w:t xml:space="preserve">  'harassment',</w:t>
         <w:br/>
@@ -20774,11 +20751,10 @@
         <w:br/>
         <w:t xml:space="preserve">  'other'</w:t>
         <w:br/>
-        <w:t xml:space="preserve">);</w:t>
-        <w:br/>
-        <w:t xml:space="preserve"/>
-        <w:br/>
-        <w:t xml:space="preserve">create type public.report_status as enum (</w:t>
+        <w:t>);</w:t>
+        <w:br/>
+        <w:br/>
+        <w:t>create type public.report_status as enum (</w:t>
         <w:br/>
         <w:t xml:space="preserve">  'open',</w:t>
         <w:br/>
@@ -20788,16 +20764,19 @@
         <w:br/>
         <w:t xml:space="preserve">  'dismissed'</w:t>
         <w:br/>
-        <w:t xml:space="preserve">);</w:t>
-        <w:br/>
-        <w:t xml:space="preserve"/>
-        <w:br/>
-        <w:t xml:space="preserve">create table public.profiles (</w:t>
+        <w:t>);</w:t>
+        <w:br/>
+        <w:br/>
+        <w:t>create table public.profiles (</w:t>
         <w:br/>
         <w:t xml:space="preserve">  user_id uuid primary key references auth.users(id) on delete cascade,</w:t>
         <w:br/>
         <w:t xml:space="preserve">  display_name varchar(40) not null,</w:t>
         <w:br/>
+        <w:t xml:space="preserve">  username citext not null unique,</w:t>
+        <w:br/>
+        <w:t xml:space="preserve">  avatar_path text,</w:t>
+        <w:br/>
         <w:t xml:space="preserve">  language_code varchar(16) not null default 'en',</w:t>
         <w:br/>
         <w:t xml:space="preserve">  timezone varchar(64) not null default 'UTC',</w:t>
@@ -20814,13 +20793,16 @@
         <w:br/>
         <w:t xml:space="preserve">  constraint profiles_display_name_length</w:t>
         <w:br/>
-        <w:t xml:space="preserve">    check (char_length(trim(display_name)) between 1 and 40)</w:t>
-        <w:br/>
-        <w:t xml:space="preserve">);</w:t>
-        <w:br/>
-        <w:t xml:space="preserve"/>
-        <w:br/>
-        <w:t xml:space="preserve">create table public.public_letters (</w:t>
+        <w:t xml:space="preserve">    check (char_length(trim(display_name)) between 1 and 40),</w:t>
+        <w:br/>
+        <w:t xml:space="preserve">  constraint profiles_username_format</w:t>
+        <w:br/>
+        <w:t xml:space="preserve">    check (username ~ '^[a-z][a-z0-9_]{2,19}$')</w:t>
+        <w:br/>
+        <w:t>);</w:t>
+        <w:br/>
+        <w:br/>
+        <w:t>create table public.public_letters (</w:t>
         <w:br/>
         <w:t xml:space="preserve">  id uuid primary key default gen_random_uuid(),</w:t>
         <w:br/>
@@ -20860,11 +20842,10 @@
         <w:br/>
         <w:t xml:space="preserve">    check (status &lt;&gt; 'published' or published_at is not null)</w:t>
         <w:br/>
-        <w:t xml:space="preserve">);</w:t>
-        <w:br/>
-        <w:t xml:space="preserve"/>
-        <w:br/>
-        <w:t xml:space="preserve">create table public.letter_delivery_batches (</w:t>
+        <w:t>);</w:t>
+        <w:br/>
+        <w:br/>
+        <w:t>create table public.letter_delivery_batches (</w:t>
         <w:br/>
         <w:t xml:space="preserve">  id uuid primary key default gen_random_uuid(),</w:t>
         <w:br/>
@@ -20880,11 +20861,10 @@
         <w:br/>
         <w:t xml:space="preserve">  completed_at timestamptz</w:t>
         <w:br/>
-        <w:t xml:space="preserve">);</w:t>
-        <w:br/>
-        <w:t xml:space="preserve"/>
-        <w:br/>
-        <w:t xml:space="preserve">create table public.ai_characters (</w:t>
+        <w:t>);</w:t>
+        <w:br/>
+        <w:br/>
+        <w:t>create table public.ai_characters (</w:t>
         <w:br/>
         <w:t xml:space="preserve">  id uuid primary key default gen_random_uuid(),</w:t>
         <w:br/>
@@ -20910,11 +20890,10 @@
         <w:br/>
         <w:t xml:space="preserve">  updated_at timestamptz not null default now()</w:t>
         <w:br/>
-        <w:t xml:space="preserve">);</w:t>
-        <w:br/>
-        <w:t xml:space="preserve"/>
-        <w:br/>
-        <w:t xml:space="preserve">create table public.ai_prompt_versions (</w:t>
+        <w:t>);</w:t>
+        <w:br/>
+        <w:br/>
+        <w:t>create table public.ai_prompt_versions (</w:t>
         <w:br/>
         <w:t xml:space="preserve">  id uuid primary key default gen_random_uuid(),</w:t>
         <w:br/>
@@ -20934,11 +20913,10 @@
         <w:br/>
         <w:t xml:space="preserve">  unique (ai_character_id, version)</w:t>
         <w:br/>
-        <w:t xml:space="preserve">);</w:t>
-        <w:br/>
-        <w:t xml:space="preserve"/>
-        <w:br/>
-        <w:t xml:space="preserve">create table public.conversations (</w:t>
+        <w:t>);</w:t>
+        <w:br/>
+        <w:br/>
+        <w:t>create table public.conversations (</w:t>
         <w:br/>
         <w:t xml:space="preserve">  id uuid primary key default gen_random_uuid(),</w:t>
         <w:br/>
@@ -20994,11 +20972,10 @@
         <w:br/>
         <w:t xml:space="preserve">  )</w:t>
         <w:br/>
-        <w:t xml:space="preserve">);</w:t>
-        <w:br/>
-        <w:t xml:space="preserve"/>
-        <w:br/>
-        <w:t xml:space="preserve">create table public.letter_deliveries (</w:t>
+        <w:t>);</w:t>
+        <w:br/>
+        <w:br/>
+        <w:t>create table public.letter_deliveries (</w:t>
         <w:br/>
         <w:t xml:space="preserve">  id uuid primary key default gen_random_uuid(),</w:t>
         <w:br/>
@@ -21032,11 +21009,10 @@
         <w:br/>
         <w:t xml:space="preserve">  constraint letter_deliveries_position check (position &gt;= 1 and position &lt;= 20)</w:t>
         <w:br/>
-        <w:t xml:space="preserve">);</w:t>
-        <w:br/>
-        <w:t xml:space="preserve"/>
-        <w:br/>
-        <w:t xml:space="preserve">alter table public.conversations</w:t>
+        <w:t>);</w:t>
+        <w:br/>
+        <w:br/>
+        <w:t>alter table public.conversations</w:t>
         <w:br/>
         <w:t xml:space="preserve">  add constraint conversations_created_from_delivery_fk</w:t>
         <w:br/>
@@ -21044,9 +21020,8 @@
         <w:br/>
         <w:t xml:space="preserve">  references public.letter_deliveries(id);</w:t>
         <w:br/>
-        <w:t xml:space="preserve"/>
-        <w:br/>
-        <w:t xml:space="preserve">create table public.messages (</w:t>
+        <w:br/>
+        <w:t>create table public.messages (</w:t>
         <w:br/>
         <w:t xml:space="preserve">  id uuid primary key default gen_random_uuid(),</w:t>
         <w:br/>
@@ -21128,11 +21103,10 @@
         <w:br/>
         <w:t xml:space="preserve">  )</w:t>
         <w:br/>
-        <w:t xml:space="preserve">);</w:t>
-        <w:br/>
-        <w:t xml:space="preserve"/>
-        <w:br/>
-        <w:t xml:space="preserve">create table public.ai_response_jobs (</w:t>
+        <w:t>);</w:t>
+        <w:br/>
+        <w:br/>
+        <w:t>create table public.ai_response_jobs (</w:t>
         <w:br/>
         <w:t xml:space="preserve">  id uuid primary key default gen_random_uuid(),</w:t>
         <w:br/>
@@ -21176,11 +21150,10 @@
         <w:br/>
         <w:t xml:space="preserve">  )</w:t>
         <w:br/>
-        <w:t xml:space="preserve">);</w:t>
-        <w:br/>
-        <w:t xml:space="preserve"/>
-        <w:br/>
-        <w:t xml:space="preserve">create table public.user_blocks (</w:t>
+        <w:t>);</w:t>
+        <w:br/>
+        <w:br/>
+        <w:t>create table public.user_blocks (</w:t>
         <w:br/>
         <w:t xml:space="preserve">  blocker_user_id uuid not null references public.profiles(user_id),</w:t>
         <w:br/>
@@ -21192,11 +21165,10 @@
         <w:br/>
         <w:t xml:space="preserve">  constraint user_blocks_not_self check (blocker_user_id &lt;&gt; blocked_user_id)</w:t>
         <w:br/>
-        <w:t xml:space="preserve">);</w:t>
-        <w:br/>
-        <w:t xml:space="preserve"/>
-        <w:br/>
-        <w:t xml:space="preserve">create table public.reports (</w:t>
+        <w:t>);</w:t>
+        <w:br/>
+        <w:br/>
+        <w:t>create table public.reports (</w:t>
         <w:br/>
         <w:t xml:space="preserve">  id uuid primary key default gen_random_uuid(),</w:t>
         <w:br/>
@@ -21220,7 +21192,17 @@
         <w:br/>
         <w:t xml:space="preserve">    check (details is null or char_length(details) &lt;= 2000)</w:t>
         <w:br/>
-        <w:t xml:space="preserve">);</w:t>
+        <w:t>);</w:t>
+      </w:r>
+    </w:p>
+    <w:p>
+      <w:r>
+        <w:t>说明（用户名与定向信件）：username 为全局唯一 handle（citext 大小写不敏感唯一；3–20 位，须以字母开头，仅含字母/数字/下划线），与可重复的 display_name 分离；注册时分配，并设保留名黑名单（admin / root / system / support / thestationery 等）。写信时收件人 username 为可选：留空＝公开信，沿用现有 delivery / matching 逻辑（留给陌生人发现）；填写＝定向信件，直接投递给该用户。MVP 前端已加地址行与格式校验；对应的投递字段（如 public_letters.recipient_user_id）与端点在后续 migrations 中落地。</w:t>
+      </w:r>
+    </w:p>
+    <w:p>
+      <w:r>
+        <w:t>说明（头像存储）：头像文件存于 Supabase Storage 的 avatars bucket（建议私有；路径约定 avatars/{user_id}/{uuid}.png），profiles.avatar_path 仅存 bucket 内对象路径（不存完整 URL）；展示时用 signed URL 或经后端代理。仅头像上传属于例外，信件正文仍不支持图片 / 附件。</w:t>
       </w:r>
     </w:p>
     <w:p>

</xml_diff>